<commit_message>
adding interaction plots to targets & Qmd
</commit_message>
<xml_diff>
--- a/R/SuRGE stats paper [version 2026-03-23].docx
+++ b/R/SuRGE stats paper [version 2026-03-23].docx
@@ -11666,7 +11666,7 @@
     </w:p>
     <w:bookmarkEnd w:id="22"/>
     <w:bookmarkEnd w:id="23"/>
-    <w:bookmarkStart w:id="33" w:name="results"/>
+    <w:bookmarkStart w:id="36" w:name="results"/>
     <w:p>
       <w:pPr>
         <w:pStyle w:val="Heading2"/>
@@ -16171,17 +16171,61 @@
     </w:p>
     <w:p>
       <w:pPr>
-        <w:pStyle w:val="SourceCode"/>
+        <w:pStyle w:val="CaptionedFigure"/>
       </w:pPr>
       <w:r>
-        <w:rPr>
-          <w:rStyle w:val="VerbatimChar"/>
-        </w:rPr>
-        <w:t xml:space="preserve">[1] "in progress"</w:t>
+        <w:drawing>
+          <wp:inline>
+            <wp:extent cx="4267200" cy="1422399"/>
+            <wp:effectExtent b="0" l="0" r="0" t="0"/>
+            <wp:docPr descr="Figure 5. Interaction plots for top variables for CH[4] total." title="" id="34" name="Picture"/>
+            <a:graphic>
+              <a:graphicData uri="http://schemas.openxmlformats.org/drawingml/2006/picture">
+                <pic:pic>
+                  <pic:nvPicPr>
+                    <pic:cNvPr descr="SuRGE_stats_paper_files/figure-docx/interaction_plots-1.png" id="35" name="Picture"/>
+                    <pic:cNvPicPr>
+                      <a:picLocks noChangeArrowheads="1" noChangeAspect="1"/>
+                    </pic:cNvPicPr>
+                  </pic:nvPicPr>
+                  <pic:blipFill>
+                    <a:blip r:embed="rId33"/>
+                    <a:stretch>
+                      <a:fillRect/>
+                    </a:stretch>
+                  </pic:blipFill>
+                  <pic:spPr bwMode="auto">
+                    <a:xfrm>
+                      <a:off x="0" y="0"/>
+                      <a:ext cx="4267200" cy="1422399"/>
+                    </a:xfrm>
+                    <a:prstGeom prst="rect">
+                      <a:avLst/>
+                    </a:prstGeom>
+                    <a:noFill/>
+                    <a:ln w="9525">
+                      <a:noFill/>
+                      <a:headEnd/>
+                      <a:tailEnd/>
+                    </a:ln>
+                  </pic:spPr>
+                </pic:pic>
+              </a:graphicData>
+            </a:graphic>
+          </wp:inline>
+        </w:drawing>
       </w:r>
     </w:p>
-    <w:bookmarkEnd w:id="33"/>
-    <w:bookmarkStart w:id="38" w:name="discussion"/>
+    <w:p>
+      <w:pPr>
+        <w:pStyle w:val="ImageCaption"/>
+      </w:pPr>
+      <w:r>
+        <w:t xml:space="preserve">Figure 5. Interaction plots for top variables for CH[4] total.</w:t>
+      </w:r>
+    </w:p>
+    <w:bookmarkEnd w:id="36"/>
+    <w:bookmarkStart w:id="41" w:name="discussion"/>
     <w:p>
       <w:pPr>
         <w:pStyle w:val="Heading2"/>
@@ -16190,7 +16234,7 @@
         <w:t xml:space="preserve">Discussion</w:t>
       </w:r>
     </w:p>
-    <w:bookmarkStart w:id="34" w:name="morphometry"/>
+    <w:bookmarkStart w:id="37" w:name="morphometry"/>
     <w:p>
       <w:pPr>
         <w:pStyle w:val="Heading3"/>
@@ -16653,8 +16697,8 @@
         <w:t xml:space="preserve">total and diffusion, but was not selected as an important variable in any of the local models, possibly because the local models also include measurements of sediment organic matter (third most important predictor in the total and diffusive local models) which may serve as a stronger index of carbon availability than RDA.</w:t>
       </w:r>
     </w:p>
-    <w:bookmarkEnd w:id="34"/>
-    <w:bookmarkStart w:id="35" w:name="carbon"/>
+    <w:bookmarkEnd w:id="37"/>
+    <w:bookmarkStart w:id="38" w:name="carbon"/>
     <w:p>
       <w:pPr>
         <w:pStyle w:val="Heading3"/>
@@ -16956,8 +17000,8 @@
         <w:t xml:space="preserve">style of sampling used in the SuRGE project could not account for these patterns and may not reflect the availability of algal derived carbon in the sediments which integrates across the short-term temporal variation in phytoplankton abundance observed at the water surface.</w:t>
       </w:r>
     </w:p>
-    <w:bookmarkEnd w:id="35"/>
-    <w:bookmarkStart w:id="36" w:name="sulfate"/>
+    <w:bookmarkEnd w:id="38"/>
+    <w:bookmarkStart w:id="39" w:name="sulfate"/>
     <w:p>
       <w:pPr>
         <w:pStyle w:val="Heading3"/>
@@ -17243,8 +17287,8 @@
         <w:t xml:space="preserve">oxidation in the water column.</w:t>
       </w:r>
     </w:p>
-    <w:bookmarkEnd w:id="36"/>
-    <w:bookmarkStart w:id="37" w:name="reservoir-age"/>
+    <w:bookmarkEnd w:id="39"/>
+    <w:bookmarkStart w:id="40" w:name="reservoir-age"/>
     <w:p>
       <w:pPr>
         <w:pStyle w:val="Heading3"/>
@@ -17348,9 +17392,9 @@
         <w:t xml:space="preserve">emissions.</w:t>
       </w:r>
     </w:p>
-    <w:bookmarkEnd w:id="37"/>
-    <w:bookmarkEnd w:id="38"/>
-    <w:bookmarkStart w:id="44" w:name="section-on-predictive-accuracy"/>
+    <w:bookmarkEnd w:id="40"/>
+    <w:bookmarkEnd w:id="41"/>
+    <w:bookmarkStart w:id="47" w:name="section-on-predictive-accuracy"/>
     <w:p>
       <w:pPr>
         <w:pStyle w:val="Heading2"/>
@@ -17359,7 +17403,7 @@
         <w:t xml:space="preserve">Section on predictive accuracy?</w:t>
       </w:r>
     </w:p>
-    <w:bookmarkStart w:id="39" w:name="ebullition-vs-diffusion"/>
+    <w:bookmarkStart w:id="42" w:name="ebullition-vs-diffusion"/>
     <w:p>
       <w:pPr>
         <w:pStyle w:val="Heading3"/>
@@ -17434,8 +17478,8 @@
         <w:t xml:space="preserve">. Spatially dependent model error for total emission rates was intermediate to that of ebullition and diffusion because it is composed of the sum of the two emission pathways and therefore reflects characteristics of each.</w:t>
       </w:r>
     </w:p>
-    <w:bookmarkEnd w:id="39"/>
-    <w:bookmarkStart w:id="40" w:name="implications-for-survey-designs"/>
+    <w:bookmarkEnd w:id="42"/>
+    <w:bookmarkStart w:id="43" w:name="implications-for-survey-designs"/>
     <w:p>
       <w:pPr>
         <w:pStyle w:val="Heading3"/>
@@ -17509,8 +17553,8 @@
         <w:t xml:space="preserve">emission rate estimate, investigators should consider the relative importance of diffusion and ebullition when designing surveys. In systems where ebullition is more important than diffusion, the reservoir-scale total emission rate estimate will be more constrained if the survey design specifies that limited sampling resources (e.g. personnel hours) are biased toward more ebullition measurements at the expense of fewer diffusion estimates.</w:t>
       </w:r>
     </w:p>
-    <w:bookmarkEnd w:id="40"/>
-    <w:bookmarkStart w:id="41" w:name="local-vs-national-models"/>
+    <w:bookmarkEnd w:id="43"/>
+    <w:bookmarkStart w:id="44" w:name="local-vs-national-models"/>
     <w:p>
       <w:pPr>
         <w:pStyle w:val="Heading3"/>
@@ -17540,8 +17584,8 @@
         <w:t xml:space="preserve">. Inventory compilers should weigh the costs of generating the data required for local models against the accuracy gain when choosing the most appropriate modeling approach for their application.</w:t>
       </w:r>
     </w:p>
-    <w:bookmarkEnd w:id="41"/>
-    <w:bookmarkStart w:id="42" w:name="comparison-to-other-models"/>
+    <w:bookmarkEnd w:id="44"/>
+    <w:bookmarkStart w:id="45" w:name="comparison-to-other-models"/>
     <w:p>
       <w:pPr>
         <w:pStyle w:val="Heading3"/>
@@ -17622,8 +17666,8 @@
         <w:t xml:space="preserve">How much uncertainty in inventory predictions from this model? Is this model good enough? How much better than existing models? Where do we go from here? Does more data mean better models? Are statistical/machine learning models the way to go? Should we be moving toward improved mechanistic models?</w:t>
       </w:r>
     </w:p>
-    <w:bookmarkEnd w:id="42"/>
-    <w:bookmarkStart w:id="43" w:name="other-ideas"/>
+    <w:bookmarkEnd w:id="45"/>
+    <w:bookmarkStart w:id="46" w:name="other-ideas"/>
     <w:p>
       <w:pPr>
         <w:pStyle w:val="Heading3"/>
@@ -17640,9 +17684,9 @@
         <w:t xml:space="preserve">There were relatively fewer strong predictors of methane ebullition, which is consistent with the episodic nature of ebullition in both time and space.</w:t>
       </w:r>
     </w:p>
-    <w:bookmarkEnd w:id="43"/>
-    <w:bookmarkEnd w:id="44"/>
-    <w:bookmarkStart w:id="131" w:name="references"/>
+    <w:bookmarkEnd w:id="46"/>
+    <w:bookmarkEnd w:id="47"/>
+    <w:bookmarkStart w:id="134" w:name="references"/>
     <w:p>
       <w:pPr>
         <w:pStyle w:val="Heading2"/>
@@ -17821,8 +17865,8 @@
         <w:t xml:space="preserve">Rachel Pilla 12:39 PM Today Added a couple suggestions, but this makes a lot of sense to me, and follows what I’d generally expect. One other potential explanation might be if sediment C is more readily metabolized into CH4 in shallower lakes due to perhaps warmer bottom temperatures or higher bottom DO? Not sure if there’s evidence to support this per se, but more of that sed C in deeper lakes could be buried before converted to CH4 in cold, anoxic conditions. [e]Bottom temperature isn’t showing up as important predictor in the RF models, so I don’t want to make too much of this idea, although I think it makes perfect sense and I tried to find evidence for it with the gamm. I added a sentence to the end of the paragraph.</w:t>
       </w:r>
     </w:p>
-    <w:bookmarkStart w:id="130" w:name="refs"/>
-    <w:bookmarkStart w:id="46" w:name="ref-bansal_2023"/>
+    <w:bookmarkStart w:id="133" w:name="refs"/>
+    <w:bookmarkStart w:id="49" w:name="ref-bansal_2023"/>
     <w:p>
       <w:pPr>
         <w:pStyle w:val="Bibliography"/>
@@ -17833,7 +17877,7 @@
       <w:r>
         <w:t xml:space="preserve"> </w:t>
       </w:r>
-      <w:hyperlink r:id="rId45">
+      <w:hyperlink r:id="rId48">
         <w:r>
           <w:rPr>
             <w:rStyle w:val="Hyperlink"/>
@@ -17842,8 +17886,8 @@
         </w:r>
       </w:hyperlink>
     </w:p>
-    <w:bookmarkEnd w:id="46"/>
-    <w:bookmarkStart w:id="48" w:name="ref-barros_2011"/>
+    <w:bookmarkEnd w:id="49"/>
+    <w:bookmarkStart w:id="51" w:name="ref-barros_2011"/>
     <w:p>
       <w:pPr>
         <w:pStyle w:val="Bibliography"/>
@@ -17854,7 +17898,7 @@
       <w:r>
         <w:t xml:space="preserve"> </w:t>
       </w:r>
-      <w:hyperlink r:id="rId47">
+      <w:hyperlink r:id="rId50">
         <w:r>
           <w:rPr>
             <w:rStyle w:val="Hyperlink"/>
@@ -17863,8 +17907,8 @@
         </w:r>
       </w:hyperlink>
     </w:p>
-    <w:bookmarkEnd w:id="48"/>
-    <w:bookmarkStart w:id="50" w:name="ref-bastviken_2008"/>
+    <w:bookmarkEnd w:id="51"/>
+    <w:bookmarkStart w:id="53" w:name="ref-bastviken_2008"/>
     <w:p>
       <w:pPr>
         <w:pStyle w:val="Bibliography"/>
@@ -17875,7 +17919,7 @@
       <w:r>
         <w:t xml:space="preserve"> </w:t>
       </w:r>
-      <w:hyperlink r:id="rId49">
+      <w:hyperlink r:id="rId52">
         <w:r>
           <w:rPr>
             <w:rStyle w:val="Hyperlink"/>
@@ -17884,8 +17928,8 @@
         </w:r>
       </w:hyperlink>
     </w:p>
-    <w:bookmarkEnd w:id="50"/>
-    <w:bookmarkStart w:id="52" w:name="ref-bastviken_2025"/>
+    <w:bookmarkEnd w:id="53"/>
+    <w:bookmarkStart w:id="55" w:name="ref-bastviken_2025"/>
     <w:p>
       <w:pPr>
         <w:pStyle w:val="Bibliography"/>
@@ -17896,7 +17940,7 @@
       <w:r>
         <w:t xml:space="preserve"> </w:t>
       </w:r>
-      <w:hyperlink r:id="rId51">
+      <w:hyperlink r:id="rId54">
         <w:r>
           <w:rPr>
             <w:rStyle w:val="Hyperlink"/>
@@ -17917,8 +17961,8 @@
         </w:r>
       </w:hyperlink>
     </w:p>
-    <w:bookmarkEnd w:id="52"/>
-    <w:bookmarkStart w:id="54" w:name="ref-beaulieu_et_al_2026"/>
+    <w:bookmarkEnd w:id="55"/>
+    <w:bookmarkStart w:id="57" w:name="ref-beaulieu_et_al_2026"/>
     <w:p>
       <w:pPr>
         <w:pStyle w:val="Bibliography"/>
@@ -17929,7 +17973,7 @@
       <w:r>
         <w:t xml:space="preserve"> </w:t>
       </w:r>
-      <w:hyperlink r:id="rId53">
+      <w:hyperlink r:id="rId56">
         <w:r>
           <w:rPr>
             <w:rStyle w:val="Hyperlink"/>
@@ -17938,8 +17982,8 @@
         </w:r>
       </w:hyperlink>
     </w:p>
-    <w:bookmarkEnd w:id="54"/>
-    <w:bookmarkStart w:id="56" w:name="ref-beaulieu_et_al_2020"/>
+    <w:bookmarkEnd w:id="57"/>
+    <w:bookmarkStart w:id="59" w:name="ref-beaulieu_et_al_2020"/>
     <w:p>
       <w:pPr>
         <w:pStyle w:val="Bibliography"/>
@@ -17950,7 +17994,7 @@
       <w:r>
         <w:t xml:space="preserve"> </w:t>
       </w:r>
-      <w:hyperlink r:id="rId55">
+      <w:hyperlink r:id="rId58">
         <w:r>
           <w:rPr>
             <w:rStyle w:val="Hyperlink"/>
@@ -17959,8 +18003,8 @@
         </w:r>
       </w:hyperlink>
     </w:p>
-    <w:bookmarkEnd w:id="56"/>
-    <w:bookmarkStart w:id="58" w:name="ref-berberich_2019"/>
+    <w:bookmarkEnd w:id="59"/>
+    <w:bookmarkStart w:id="61" w:name="ref-berberich_2019"/>
     <w:p>
       <w:pPr>
         <w:pStyle w:val="Bibliography"/>
@@ -17971,7 +18015,7 @@
       <w:r>
         <w:t xml:space="preserve"> </w:t>
       </w:r>
-      <w:hyperlink r:id="rId57">
+      <w:hyperlink r:id="rId60">
         <w:r>
           <w:rPr>
             <w:rStyle w:val="Hyperlink"/>
@@ -17980,8 +18024,8 @@
         </w:r>
       </w:hyperlink>
     </w:p>
-    <w:bookmarkEnd w:id="58"/>
-    <w:bookmarkStart w:id="60" w:name="ref-bodmer_2025"/>
+    <w:bookmarkEnd w:id="61"/>
+    <w:bookmarkStart w:id="63" w:name="ref-bodmer_2025"/>
     <w:p>
       <w:pPr>
         <w:pStyle w:val="Bibliography"/>
@@ -17992,7 +18036,7 @@
       <w:r>
         <w:t xml:space="preserve"> </w:t>
       </w:r>
-      <w:hyperlink r:id="rId59">
+      <w:hyperlink r:id="rId62">
         <w:r>
           <w:rPr>
             <w:rStyle w:val="Hyperlink"/>
@@ -18001,8 +18045,8 @@
         </w:r>
       </w:hyperlink>
     </w:p>
-    <w:bookmarkEnd w:id="60"/>
-    <w:bookmarkStart w:id="62" w:name="ref-breiman_2001"/>
+    <w:bookmarkEnd w:id="63"/>
+    <w:bookmarkStart w:id="65" w:name="ref-breiman_2001"/>
     <w:p>
       <w:pPr>
         <w:pStyle w:val="Bibliography"/>
@@ -18013,7 +18057,7 @@
       <w:r>
         <w:t xml:space="preserve"> </w:t>
       </w:r>
-      <w:hyperlink r:id="rId61">
+      <w:hyperlink r:id="rId64">
         <w:r>
           <w:rPr>
             <w:rStyle w:val="Hyperlink"/>
@@ -18022,8 +18066,8 @@
         </w:r>
       </w:hyperlink>
     </w:p>
-    <w:bookmarkEnd w:id="62"/>
-    <w:bookmarkStart w:id="64" w:name="ref-casas_ruiz_2021"/>
+    <w:bookmarkEnd w:id="65"/>
+    <w:bookmarkStart w:id="67" w:name="ref-casas_ruiz_2021"/>
     <w:p>
       <w:pPr>
         <w:pStyle w:val="Bibliography"/>
@@ -18034,7 +18078,7 @@
       <w:r>
         <w:t xml:space="preserve"> </w:t>
       </w:r>
-      <w:hyperlink r:id="rId63">
+      <w:hyperlink r:id="rId66">
         <w:r>
           <w:rPr>
             <w:rStyle w:val="Hyperlink"/>
@@ -18055,8 +18099,8 @@
         </w:r>
       </w:hyperlink>
     </w:p>
-    <w:bookmarkEnd w:id="64"/>
-    <w:bookmarkStart w:id="66" w:name="ref-death_fabricius_2000"/>
+    <w:bookmarkEnd w:id="67"/>
+    <w:bookmarkStart w:id="69" w:name="ref-death_fabricius_2000"/>
     <w:p>
       <w:pPr>
         <w:pStyle w:val="Bibliography"/>
@@ -18067,7 +18111,7 @@
       <w:r>
         <w:t xml:space="preserve"> </w:t>
       </w:r>
-      <w:hyperlink r:id="rId65">
+      <w:hyperlink r:id="rId68">
         <w:r>
           <w:rPr>
             <w:rStyle w:val="Hyperlink"/>
@@ -18082,8 +18126,8 @@
         </w:r>
       </w:hyperlink>
     </w:p>
-    <w:bookmarkEnd w:id="66"/>
-    <w:bookmarkStart w:id="68" w:name="ref-deemer_et_al_2016"/>
+    <w:bookmarkEnd w:id="69"/>
+    <w:bookmarkStart w:id="71" w:name="ref-deemer_et_al_2016"/>
     <w:p>
       <w:pPr>
         <w:pStyle w:val="Bibliography"/>
@@ -18094,7 +18138,7 @@
       <w:r>
         <w:t xml:space="preserve"> </w:t>
       </w:r>
-      <w:hyperlink r:id="rId67">
+      <w:hyperlink r:id="rId70">
         <w:r>
           <w:rPr>
             <w:rStyle w:val="Hyperlink"/>
@@ -18103,8 +18147,8 @@
         </w:r>
       </w:hyperlink>
     </w:p>
-    <w:bookmarkEnd w:id="68"/>
-    <w:bookmarkStart w:id="70" w:name="ref-deemer_2021"/>
+    <w:bookmarkEnd w:id="71"/>
+    <w:bookmarkStart w:id="73" w:name="ref-deemer_2021"/>
     <w:p>
       <w:pPr>
         <w:pStyle w:val="Bibliography"/>
@@ -18115,7 +18159,7 @@
       <w:r>
         <w:t xml:space="preserve"> </w:t>
       </w:r>
-      <w:hyperlink r:id="rId69">
+      <w:hyperlink r:id="rId72">
         <w:r>
           <w:rPr>
             <w:rStyle w:val="Hyperlink"/>
@@ -18124,8 +18168,8 @@
         </w:r>
       </w:hyperlink>
     </w:p>
-    <w:bookmarkEnd w:id="70"/>
-    <w:bookmarkStart w:id="72" w:name="ref-delsontro_2018"/>
+    <w:bookmarkEnd w:id="73"/>
+    <w:bookmarkStart w:id="75" w:name="ref-delsontro_2018"/>
     <w:p>
       <w:pPr>
         <w:pStyle w:val="Bibliography"/>
@@ -18136,7 +18180,7 @@
       <w:r>
         <w:t xml:space="preserve"> </w:t>
       </w:r>
-      <w:hyperlink r:id="rId71">
+      <w:hyperlink r:id="rId74">
         <w:r>
           <w:rPr>
             <w:rStyle w:val="Hyperlink"/>
@@ -18148,8 +18192,8 @@
         <w:t xml:space="preserve">. Ecosystems 21:1073–87.</w:t>
       </w:r>
     </w:p>
-    <w:bookmarkEnd w:id="72"/>
-    <w:bookmarkStart w:id="74" w:name="ref-desrosiers_2022"/>
+    <w:bookmarkEnd w:id="75"/>
+    <w:bookmarkStart w:id="77" w:name="ref-desrosiers_2022"/>
     <w:p>
       <w:pPr>
         <w:pStyle w:val="Bibliography"/>
@@ -18160,7 +18204,7 @@
       <w:r>
         <w:t xml:space="preserve"> </w:t>
       </w:r>
-      <w:hyperlink r:id="rId73">
+      <w:hyperlink r:id="rId76">
         <w:r>
           <w:rPr>
             <w:rStyle w:val="Hyperlink"/>
@@ -18172,8 +18216,8 @@
         <w:t xml:space="preserve">. Ecosystems 25:1522–41.</w:t>
       </w:r>
     </w:p>
-    <w:bookmarkEnd w:id="74"/>
-    <w:bookmarkStart w:id="76" w:name="ref-friedman_2001"/>
+    <w:bookmarkEnd w:id="77"/>
+    <w:bookmarkStart w:id="79" w:name="ref-friedman_2001"/>
     <w:p>
       <w:pPr>
         <w:pStyle w:val="Bibliography"/>
@@ -18184,7 +18228,7 @@
       <w:r>
         <w:t xml:space="preserve"> </w:t>
       </w:r>
-      <w:hyperlink r:id="rId75">
+      <w:hyperlink r:id="rId78">
         <w:r>
           <w:rPr>
             <w:rStyle w:val="Hyperlink"/>
@@ -18193,8 +18237,8 @@
         </w:r>
       </w:hyperlink>
     </w:p>
-    <w:bookmarkEnd w:id="76"/>
-    <w:bookmarkStart w:id="78" w:name="ref-hanly_et_al_2025"/>
+    <w:bookmarkEnd w:id="79"/>
+    <w:bookmarkStart w:id="81" w:name="ref-hanly_et_al_2025"/>
     <w:p>
       <w:pPr>
         <w:pStyle w:val="Bibliography"/>
@@ -18205,7 +18249,7 @@
       <w:r>
         <w:t xml:space="preserve"> </w:t>
       </w:r>
-      <w:hyperlink r:id="rId77">
+      <w:hyperlink r:id="rId80">
         <w:r>
           <w:rPr>
             <w:rStyle w:val="Hyperlink"/>
@@ -18214,8 +18258,8 @@
         </w:r>
       </w:hyperlink>
     </w:p>
-    <w:bookmarkEnd w:id="78"/>
-    <w:bookmarkStart w:id="80" w:name="ref-hill_et_al_2018"/>
+    <w:bookmarkEnd w:id="81"/>
+    <w:bookmarkStart w:id="83" w:name="ref-hill_et_al_2018"/>
     <w:p>
       <w:pPr>
         <w:pStyle w:val="Bibliography"/>
@@ -18226,7 +18270,7 @@
       <w:r>
         <w:t xml:space="preserve"> </w:t>
       </w:r>
-      <w:hyperlink r:id="rId79">
+      <w:hyperlink r:id="rId82">
         <w:r>
           <w:rPr>
             <w:rStyle w:val="Hyperlink"/>
@@ -18235,8 +18279,8 @@
         </w:r>
       </w:hyperlink>
     </w:p>
-    <w:bookmarkEnd w:id="80"/>
-    <w:bookmarkStart w:id="82" w:name="ref-hoffman_2013"/>
+    <w:bookmarkEnd w:id="83"/>
+    <w:bookmarkStart w:id="85" w:name="ref-hoffman_2013"/>
     <w:p>
       <w:pPr>
         <w:pStyle w:val="Bibliography"/>
@@ -18247,7 +18291,7 @@
       <w:r>
         <w:t xml:space="preserve"> </w:t>
       </w:r>
-      <w:hyperlink r:id="rId81">
+      <w:hyperlink r:id="rId84">
         <w:r>
           <w:rPr>
             <w:rStyle w:val="Hyperlink"/>
@@ -18268,8 +18312,8 @@
         </w:r>
       </w:hyperlink>
     </w:p>
-    <w:bookmarkEnd w:id="82"/>
-    <w:bookmarkStart w:id="84" w:name="ref-khazaei_2022"/>
+    <w:bookmarkEnd w:id="85"/>
+    <w:bookmarkStart w:id="87" w:name="ref-khazaei_2022"/>
     <w:p>
       <w:pPr>
         <w:pStyle w:val="Bibliography"/>
@@ -18280,7 +18324,7 @@
       <w:r>
         <w:t xml:space="preserve"> </w:t>
       </w:r>
-      <w:hyperlink r:id="rId83">
+      <w:hyperlink r:id="rId86">
         <w:r>
           <w:rPr>
             <w:rStyle w:val="Hyperlink"/>
@@ -18301,8 +18345,8 @@
         </w:r>
       </w:hyperlink>
     </w:p>
-    <w:bookmarkEnd w:id="84"/>
-    <w:bookmarkStart w:id="86" w:name="ref-leon_palmero_2020"/>
+    <w:bookmarkEnd w:id="87"/>
+    <w:bookmarkStart w:id="89" w:name="ref-leon_palmero_2020"/>
     <w:p>
       <w:pPr>
         <w:pStyle w:val="Bibliography"/>
@@ -18313,7 +18357,7 @@
       <w:r>
         <w:t xml:space="preserve"> </w:t>
       </w:r>
-      <w:hyperlink r:id="rId85">
+      <w:hyperlink r:id="rId88">
         <w:r>
           <w:rPr>
             <w:rStyle w:val="Hyperlink"/>
@@ -18325,8 +18369,8 @@
         <w:t xml:space="preserve">. Environmental Research Letters 15.</w:t>
       </w:r>
     </w:p>
-    <w:bookmarkEnd w:id="86"/>
-    <w:bookmarkStart w:id="88" w:name="ref-martinez_2024"/>
+    <w:bookmarkEnd w:id="89"/>
+    <w:bookmarkStart w:id="91" w:name="ref-martinez_2024"/>
     <w:p>
       <w:pPr>
         <w:pStyle w:val="Bibliography"/>
@@ -18337,7 +18381,7 @@
       <w:r>
         <w:t xml:space="preserve"> </w:t>
       </w:r>
-      <w:hyperlink r:id="rId87">
+      <w:hyperlink r:id="rId90">
         <w:r>
           <w:rPr>
             <w:rStyle w:val="Hyperlink"/>
@@ -18346,8 +18390,8 @@
         </w:r>
       </w:hyperlink>
     </w:p>
-    <w:bookmarkEnd w:id="88"/>
-    <w:bookmarkStart w:id="90" w:name="ref-mcginnis_2006"/>
+    <w:bookmarkEnd w:id="91"/>
+    <w:bookmarkStart w:id="93" w:name="ref-mcginnis_2006"/>
     <w:p>
       <w:pPr>
         <w:pStyle w:val="Bibliography"/>
@@ -18358,7 +18402,7 @@
       <w:r>
         <w:t xml:space="preserve"> </w:t>
       </w:r>
-      <w:hyperlink r:id="rId89">
+      <w:hyperlink r:id="rId92">
         <w:r>
           <w:rPr>
             <w:rStyle w:val="Hyperlink"/>
@@ -18367,8 +18411,8 @@
         </w:r>
       </w:hyperlink>
     </w:p>
-    <w:bookmarkEnd w:id="90"/>
-    <w:bookmarkStart w:id="92" w:name="ref-li_2020"/>
+    <w:bookmarkEnd w:id="93"/>
+    <w:bookmarkStart w:id="95" w:name="ref-li_2020"/>
     <w:p>
       <w:pPr>
         <w:pStyle w:val="Bibliography"/>
@@ -18379,7 +18423,7 @@
       <w:r>
         <w:t xml:space="preserve"> </w:t>
       </w:r>
-      <w:hyperlink r:id="rId91">
+      <w:hyperlink r:id="rId94">
         <w:r>
           <w:rPr>
             <w:rStyle w:val="Hyperlink"/>
@@ -18391,8 +18435,8 @@
         <w:t xml:space="preserve">. Water Research 172:115465.</w:t>
       </w:r>
     </w:p>
-    <w:bookmarkEnd w:id="92"/>
-    <w:bookmarkStart w:id="93" w:name="ref-montgomery_peck_1992"/>
+    <w:bookmarkEnd w:id="95"/>
+    <w:bookmarkStart w:id="96" w:name="ref-montgomery_peck_1992"/>
     <w:p>
       <w:pPr>
         <w:pStyle w:val="Bibliography"/>
@@ -18401,8 +18445,8 @@
         <w:t xml:space="preserve">Montgomery D, Peck E. 1992. Introduction to linear regression analysis. New York: Wiley</w:t>
       </w:r>
     </w:p>
-    <w:bookmarkEnd w:id="93"/>
-    <w:bookmarkStart w:id="95" w:name="ref-era5_2021"/>
+    <w:bookmarkEnd w:id="96"/>
+    <w:bookmarkStart w:id="98" w:name="ref-era5_2021"/>
     <w:p>
       <w:pPr>
         <w:pStyle w:val="Bibliography"/>
@@ -18413,7 +18457,7 @@
       <w:r>
         <w:t xml:space="preserve"> </w:t>
       </w:r>
-      <w:hyperlink r:id="rId94">
+      <w:hyperlink r:id="rId97">
         <w:r>
           <w:rPr>
             <w:rStyle w:val="Hyperlink"/>
@@ -18422,8 +18466,8 @@
         </w:r>
       </w:hyperlink>
     </w:p>
-    <w:bookmarkEnd w:id="95"/>
-    <w:bookmarkStart w:id="96" w:name="ref-prairie_2017"/>
+    <w:bookmarkEnd w:id="98"/>
+    <w:bookmarkStart w:id="99" w:name="ref-prairie_2017"/>
     <w:p>
       <w:pPr>
         <w:pStyle w:val="Bibliography"/>
@@ -18432,8 +18476,8 @@
         <w:t xml:space="preserve">Prairie YT, Alm J, Harby A, Mercier-Blais S. 2017. The GHG reservoir tool (g-res) user guide. UNESCO/IHA research project on the GHG status of freshwater reservoirs.</w:t>
       </w:r>
     </w:p>
-    <w:bookmarkEnd w:id="96"/>
-    <w:bookmarkStart w:id="98" w:name="ref-prairie_2021"/>
+    <w:bookmarkEnd w:id="99"/>
+    <w:bookmarkStart w:id="101" w:name="ref-prairie_2021"/>
     <w:p>
       <w:pPr>
         <w:pStyle w:val="Bibliography"/>
@@ -18444,7 +18488,7 @@
       <w:r>
         <w:t xml:space="preserve"> </w:t>
       </w:r>
-      <w:hyperlink r:id="rId97">
+      <w:hyperlink r:id="rId100">
         <w:r>
           <w:rPr>
             <w:rStyle w:val="Hyperlink"/>
@@ -18453,8 +18497,8 @@
         </w:r>
       </w:hyperlink>
     </w:p>
-    <w:bookmarkEnd w:id="98"/>
-    <w:bookmarkStart w:id="100" w:name="ref-r_core_team_2025"/>
+    <w:bookmarkEnd w:id="101"/>
+    <w:bookmarkStart w:id="103" w:name="ref-r_core_team_2025"/>
     <w:p>
       <w:pPr>
         <w:pStyle w:val="Bibliography"/>
@@ -18465,7 +18509,7 @@
       <w:r>
         <w:t xml:space="preserve"> </w:t>
       </w:r>
-      <w:hyperlink r:id="rId99">
+      <w:hyperlink r:id="rId102">
         <w:r>
           <w:rPr>
             <w:rStyle w:val="Hyperlink"/>
@@ -18474,8 +18518,8 @@
         </w:r>
       </w:hyperlink>
     </w:p>
-    <w:bookmarkEnd w:id="100"/>
-    <w:bookmarkStart w:id="102" w:name="ref-rasilo_et_al_2015"/>
+    <w:bookmarkEnd w:id="103"/>
+    <w:bookmarkStart w:id="105" w:name="ref-rasilo_et_al_2015"/>
     <w:p>
       <w:pPr>
         <w:pStyle w:val="Bibliography"/>
@@ -18486,7 +18530,7 @@
       <w:r>
         <w:t xml:space="preserve"> </w:t>
       </w:r>
-      <w:hyperlink r:id="rId101">
+      <w:hyperlink r:id="rId104">
         <w:r>
           <w:rPr>
             <w:rStyle w:val="Hyperlink"/>
@@ -18507,8 +18551,8 @@
         </w:r>
       </w:hyperlink>
     </w:p>
-    <w:bookmarkEnd w:id="102"/>
-    <w:bookmarkStart w:id="104" w:name="ref-richardson_2022"/>
+    <w:bookmarkEnd w:id="105"/>
+    <w:bookmarkStart w:id="107" w:name="ref-richardson_2022"/>
     <w:p>
       <w:pPr>
         <w:pStyle w:val="Bibliography"/>
@@ -18519,7 +18563,7 @@
       <w:r>
         <w:t xml:space="preserve"> </w:t>
       </w:r>
-      <w:hyperlink r:id="rId103">
+      <w:hyperlink r:id="rId106">
         <w:r>
           <w:rPr>
             <w:rStyle w:val="Hyperlink"/>
@@ -18531,8 +18575,8 @@
         <w:t xml:space="preserve">. Scientific Reports 12:10472.</w:t>
       </w:r>
     </w:p>
-    <w:bookmarkEnd w:id="104"/>
-    <w:bookmarkStart w:id="106" w:name="ref-soued_2024"/>
+    <w:bookmarkEnd w:id="107"/>
+    <w:bookmarkStart w:id="109" w:name="ref-soued_2024"/>
     <w:p>
       <w:pPr>
         <w:pStyle w:val="Bibliography"/>
@@ -18543,7 +18587,7 @@
       <w:r>
         <w:t xml:space="preserve"> </w:t>
       </w:r>
-      <w:hyperlink r:id="rId105">
+      <w:hyperlink r:id="rId108">
         <w:r>
           <w:rPr>
             <w:rStyle w:val="Hyperlink"/>
@@ -18564,8 +18608,8 @@
         </w:r>
       </w:hyperlink>
     </w:p>
-    <w:bookmarkEnd w:id="106"/>
-    <w:bookmarkStart w:id="108" w:name="ref-soued_2022"/>
+    <w:bookmarkEnd w:id="109"/>
+    <w:bookmarkStart w:id="111" w:name="ref-soued_2022"/>
     <w:p>
       <w:pPr>
         <w:pStyle w:val="Bibliography"/>
@@ -18576,7 +18620,7 @@
       <w:r>
         <w:t xml:space="preserve"> </w:t>
       </w:r>
-      <w:hyperlink r:id="rId107">
+      <w:hyperlink r:id="rId110">
         <w:r>
           <w:rPr>
             <w:rStyle w:val="Hyperlink"/>
@@ -18597,8 +18641,8 @@
         </w:r>
       </w:hyperlink>
     </w:p>
-    <w:bookmarkEnd w:id="108"/>
-    <w:bookmarkStart w:id="110" w:name="ref-stevens_et_al_2004"/>
+    <w:bookmarkEnd w:id="111"/>
+    <w:bookmarkStart w:id="113" w:name="ref-stevens_et_al_2004"/>
     <w:p>
       <w:pPr>
         <w:pStyle w:val="Bibliography"/>
@@ -18609,7 +18653,7 @@
       <w:r>
         <w:t xml:space="preserve"> </w:t>
       </w:r>
-      <w:hyperlink r:id="rId109">
+      <w:hyperlink r:id="rId112">
         <w:r>
           <w:rPr>
             <w:rStyle w:val="Hyperlink"/>
@@ -18630,8 +18674,8 @@
         </w:r>
       </w:hyperlink>
     </w:p>
-    <w:bookmarkEnd w:id="110"/>
-    <w:bookmarkStart w:id="112" w:name="ref-usace_2025"/>
+    <w:bookmarkEnd w:id="113"/>
+    <w:bookmarkStart w:id="115" w:name="ref-usace_2025"/>
     <w:p>
       <w:pPr>
         <w:pStyle w:val="Bibliography"/>
@@ -18642,7 +18686,7 @@
       <w:r>
         <w:t xml:space="preserve"> </w:t>
       </w:r>
-      <w:hyperlink r:id="rId111">
+      <w:hyperlink r:id="rId114">
         <w:r>
           <w:rPr>
             <w:rStyle w:val="Hyperlink"/>
@@ -18651,8 +18695,8 @@
         </w:r>
       </w:hyperlink>
     </w:p>
-    <w:bookmarkEnd w:id="112"/>
-    <w:bookmarkStart w:id="113" w:name="ref-usepa_2022"/>
+    <w:bookmarkEnd w:id="115"/>
+    <w:bookmarkStart w:id="116" w:name="ref-usepa_2022"/>
     <w:p>
       <w:pPr>
         <w:pStyle w:val="Bibliography"/>
@@ -18661,8 +18705,8 @@
         <w:t xml:space="preserve">U.S. Environmental Protection Agency. 2022. National lakes assessment: The third collaborative survey of lakes in the united states. EPA 841-R-22-002. U.S. Environmental Protection Agency, Office of Water; Office of Research; Development</w:t>
       </w:r>
     </w:p>
-    <w:bookmarkEnd w:id="113"/>
-    <w:bookmarkStart w:id="115" w:name="ref-usepa_2024"/>
+    <w:bookmarkEnd w:id="116"/>
+    <w:bookmarkStart w:id="118" w:name="ref-usepa_2024"/>
     <w:p>
       <w:pPr>
         <w:pStyle w:val="Bibliography"/>
@@ -18673,7 +18717,7 @@
       <w:r>
         <w:t xml:space="preserve"> </w:t>
       </w:r>
-      <w:hyperlink r:id="rId114">
+      <w:hyperlink r:id="rId117">
         <w:r>
           <w:rPr>
             <w:rStyle w:val="Hyperlink"/>
@@ -18682,8 +18726,8 @@
         </w:r>
       </w:hyperlink>
     </w:p>
-    <w:bookmarkEnd w:id="115"/>
-    <w:bookmarkStart w:id="117" w:name="ref-west_2016"/>
+    <w:bookmarkEnd w:id="118"/>
+    <w:bookmarkStart w:id="120" w:name="ref-west_2016"/>
     <w:p>
       <w:pPr>
         <w:pStyle w:val="Bibliography"/>
@@ -18694,7 +18738,7 @@
       <w:r>
         <w:t xml:space="preserve"> </w:t>
       </w:r>
-      <w:hyperlink r:id="rId116">
+      <w:hyperlink r:id="rId119">
         <w:r>
           <w:rPr>
             <w:rStyle w:val="Hyperlink"/>
@@ -18703,8 +18747,8 @@
         </w:r>
       </w:hyperlink>
     </w:p>
-    <w:bookmarkEnd w:id="117"/>
-    <w:bookmarkStart w:id="119" w:name="ref-west_et_al_2015"/>
+    <w:bookmarkEnd w:id="120"/>
+    <w:bookmarkStart w:id="122" w:name="ref-west_et_al_2015"/>
     <w:p>
       <w:pPr>
         <w:pStyle w:val="Bibliography"/>
@@ -18715,7 +18759,7 @@
       <w:r>
         <w:t xml:space="preserve"> </w:t>
       </w:r>
-      <w:hyperlink r:id="rId118">
+      <w:hyperlink r:id="rId121">
         <w:r>
           <w:rPr>
             <w:rStyle w:val="Hyperlink"/>
@@ -18724,8 +18768,8 @@
         </w:r>
       </w:hyperlink>
     </w:p>
-    <w:bookmarkEnd w:id="119"/>
-    <w:bookmarkStart w:id="121" w:name="ref-wright_ziegler_2017"/>
+    <w:bookmarkEnd w:id="122"/>
+    <w:bookmarkStart w:id="124" w:name="ref-wright_ziegler_2017"/>
     <w:p>
       <w:pPr>
         <w:pStyle w:val="Bibliography"/>
@@ -18736,7 +18780,7 @@
       <w:r>
         <w:t xml:space="preserve"> </w:t>
       </w:r>
-      <w:hyperlink r:id="rId120">
+      <w:hyperlink r:id="rId123">
         <w:r>
           <w:rPr>
             <w:rStyle w:val="Hyperlink"/>
@@ -18790,8 +18834,8 @@
         <w:t xml:space="preserve">. Journal of Statistical Software 77:1–17.</w:t>
       </w:r>
     </w:p>
-    <w:bookmarkEnd w:id="121"/>
-    <w:bookmarkStart w:id="123" w:name="ref-wright_et_al_2016"/>
+    <w:bookmarkEnd w:id="124"/>
+    <w:bookmarkStart w:id="126" w:name="ref-wright_et_al_2016"/>
     <w:p>
       <w:pPr>
         <w:pStyle w:val="Bibliography"/>
@@ -18802,7 +18846,7 @@
       <w:r>
         <w:t xml:space="preserve"> </w:t>
       </w:r>
-      <w:hyperlink r:id="rId122">
+      <w:hyperlink r:id="rId125">
         <w:r>
           <w:rPr>
             <w:rStyle w:val="Hyperlink"/>
@@ -18811,8 +18855,8 @@
         </w:r>
       </w:hyperlink>
     </w:p>
-    <w:bookmarkEnd w:id="123"/>
-    <w:bookmarkStart w:id="125" w:name="ref-yvon-durocher_2014"/>
+    <w:bookmarkEnd w:id="126"/>
+    <w:bookmarkStart w:id="128" w:name="ref-yvon-durocher_2014"/>
     <w:p>
       <w:pPr>
         <w:pStyle w:val="Bibliography"/>
@@ -18823,7 +18867,7 @@
       <w:r>
         <w:t xml:space="preserve"> </w:t>
       </w:r>
-      <w:hyperlink r:id="rId124">
+      <w:hyperlink r:id="rId127">
         <w:r>
           <w:rPr>
             <w:rStyle w:val="Hyperlink"/>
@@ -18832,8 +18876,8 @@
         </w:r>
       </w:hyperlink>
     </w:p>
-    <w:bookmarkEnd w:id="125"/>
-    <w:bookmarkStart w:id="127" w:name="ref-zak_2021"/>
+    <w:bookmarkEnd w:id="128"/>
+    <w:bookmarkStart w:id="130" w:name="ref-zak_2021"/>
     <w:p>
       <w:pPr>
         <w:pStyle w:val="Bibliography"/>
@@ -18844,7 +18888,7 @@
       <w:r>
         <w:t xml:space="preserve"> </w:t>
       </w:r>
-      <w:hyperlink r:id="rId126">
+      <w:hyperlink r:id="rId129">
         <w:r>
           <w:rPr>
             <w:rStyle w:val="Hyperlink"/>
@@ -18853,8 +18897,8 @@
         </w:r>
       </w:hyperlink>
     </w:p>
-    <w:bookmarkEnd w:id="127"/>
-    <w:bookmarkStart w:id="129" w:name="ref-zhou_2024"/>
+    <w:bookmarkEnd w:id="130"/>
+    <w:bookmarkStart w:id="132" w:name="ref-zhou_2024"/>
     <w:p>
       <w:pPr>
         <w:pStyle w:val="Bibliography"/>
@@ -18865,7 +18909,7 @@
       <w:r>
         <w:t xml:space="preserve"> </w:t>
       </w:r>
-      <w:hyperlink r:id="rId128">
+      <w:hyperlink r:id="rId131">
         <w:r>
           <w:rPr>
             <w:rStyle w:val="Hyperlink"/>
@@ -18874,9 +18918,9 @@
         </w:r>
       </w:hyperlink>
     </w:p>
-    <w:bookmarkEnd w:id="129"/>
-    <w:bookmarkEnd w:id="130"/>
-    <w:bookmarkEnd w:id="131"/>
+    <w:bookmarkEnd w:id="132"/>
+    <w:bookmarkEnd w:id="133"/>
+    <w:bookmarkEnd w:id="134"/>
     <w:sectPr>
       <w:footnotePr>
         <w:numRestart w:val="eachSect"/>

</xml_diff>